<commit_message>
Support SKU prefix size mappings
</commit_message>
<xml_diff>
--- a/Printbelle_Project_Guide.docx
+++ b/Printbelle_Project_Guide.docx
@@ -4632,14 +4632,7 @@
         <w:spacing w:before="0" w:after="140" w:line="276" w:lineRule="auto"/>
       </w:pPr>
       <w:r>
-        <w:rPr>
-          <w:rFonts w:ascii="Aptos" w:hAnsi="Aptos"/>
-          <w:b w:val="0"/>
-          <w:i w:val="0"/>
-          <w:color w:val="252A27"/>
-          <w:sz w:val="21"/>
-        </w:rPr>
-        <w:t>Không cần chỉnh JSON thủ công. Mở trang /settings hoặc bấm Cấu hình SPU trên trang chính. Danh mục sản phẩm dùng để thêm tên hiển thị, mã SPU, SKU prefix và các alias trong PDF; phần Ánh xạ kích cỡ dùng để chuyển kích thước trong PDF sang giá trị menu/variant của Printbelle.</w:t>
+        <w:t>Không cần chỉnh JSON thủ công. Mở trang /settings hoặc bấm Cấu hình SPU trên trang chính. Danh mục sản phẩm dùng để thêm tên hiển thị, mã SPU, SKU prefix và các alias trong PDF; phần Ánh xạ kích cỡ dùng để chuyển kích thước trong PDF sang giá trị menu/variant của Printbelle. Size mapping có thể dùng SKU prefix hoặc product code đầy đủ.</w:t>
       </w:r>
     </w:p>
     <w:p>
@@ -4664,14 +4657,7 @@
         <w:spacing w:before="0" w:after="60" w:line="276" w:lineRule="auto"/>
       </w:pPr>
       <w:r>
-        <w:rPr>
-          <w:rFonts w:ascii="Aptos" w:hAnsi="Aptos"/>
-          <w:b w:val="0"/>
-          <w:i w:val="0"/>
-          <w:color w:val="252A27"/>
-          <w:sz w:val="20"/>
-        </w:rPr>
-        <w:t>Bấm + Thêm sản phẩm trong phần Ánh xạ kích cỡ, nhập mã sản phẩm trong PDF rồi thêm các cặp kích thước nguồn và kích thước Printbelle.</w:t>
+        <w:t>Bấm + Thêm sản phẩm trong phần Ánh xạ kích cỡ, nhập SKU prefix hoặc mã sản phẩm trong PDF rồi thêm các cặp kích thước nguồn và kích thước Printbelle. Ví dụ prefix GF áp dụng cho GF-10, GF-20…; mã đầy đủ chỉ áp dụng cho SKU đó.</w:t>
       </w:r>
     </w:p>
     <w:p>

</xml_diff>